<commit_message>
fix: inject template variables into evaluation_template.docx and update export ZIP & portal document views
</commit_message>
<xml_diff>
--- a/public/evaluation_template.docx
+++ b/public/evaluation_template.docx
@@ -1896,7 +1896,7 @@
                 <w:rFonts w:hint="cs"/>
                 <w:rtl/>
               </w:rPr>
-              <w:t>إناس بنبراهيم</w:t>
+              <w:t>{sup3}</w:t>
             </w:r>
           </w:p>
         </w:tc>
@@ -2152,7 +2152,7 @@
                 <w:rFonts w:hint="cs"/>
                 <w:rtl/>
               </w:rPr>
-              <w:t>نوفل العيساوي</w:t>
+              <w:t>{sup4}</w:t>
             </w:r>
             <w:r>
               <w:rPr>
@@ -2477,78 +2477,22 @@
         <w:trPr>
           <w:trHeight w:val="408"/>
         </w:trPr>
-        <w:sdt>
-          <w:sdtPr>
-            <w:rPr>
-              <w:u w:val="single"/>
-            </w:rPr>
-            <w:id w:val="7106262"/>
-            <w14:checkbox>
-              <w14:checked w14:val="0"/>
-              <w14:checkedState w14:val="2612" w14:font="MS Gothic"/>
-              <w14:uncheckedState w14:val="2610" w14:font="MS Gothic"/>
-            </w14:checkbox>
-          </w:sdtPr>
-          <w:sdtContent>
-            <w:tc>
-              <w:tcPr>
-                <w:tcW w:w="1546" w:type="dxa"/>
-              </w:tcPr>
-              <w:p>
-                <w:pPr>
-                  <w:jc w:val="center"/>
-                  <w:rPr>
-                    <w:u w:val="single"/>
-                    <w:rtl/>
-                  </w:rPr>
-                </w:pPr>
-                <w:r>
-                  <w:rPr>
-                    <w:rFonts w:ascii="MS Gothic" w:eastAsia="MS Gothic" w:hAnsi="MS Gothic" w:hint="eastAsia"/>
-                    <w:u w:val="single"/>
-                  </w:rPr>
-                  <w:t>☐</w:t>
-                </w:r>
-              </w:p>
-            </w:tc>
-          </w:sdtContent>
-        </w:sdt>
-        <w:sdt>
-          <w:sdtPr>
-            <w:rPr>
-              <w:u w:val="single"/>
-            </w:rPr>
-            <w:id w:val="1742369815"/>
-            <w14:checkbox>
-              <w14:checked w14:val="0"/>
-              <w14:checkedState w14:val="2612" w14:font="MS Gothic"/>
-              <w14:uncheckedState w14:val="2610" w14:font="MS Gothic"/>
-            </w14:checkbox>
-          </w:sdtPr>
-          <w:sdtContent>
-            <w:tc>
-              <w:tcPr>
-                <w:tcW w:w="1823" w:type="dxa"/>
-              </w:tcPr>
-              <w:p>
-                <w:pPr>
-                  <w:jc w:val="center"/>
-                  <w:rPr>
-                    <w:u w:val="single"/>
-                    <w:rtl/>
-                  </w:rPr>
-                </w:pPr>
-                <w:r>
-                  <w:rPr>
-                    <w:rFonts w:ascii="MS Gothic" w:eastAsia="MS Gothic" w:hAnsi="MS Gothic" w:hint="eastAsia"/>
-                    <w:u w:val="single"/>
-                  </w:rPr>
-                  <w:t>☐</w:t>
-                </w:r>
-              </w:p>
-            </w:tc>
-          </w:sdtContent>
-        </w:sdt>
+        <w:p>
+          <w:pPr>
+            <w:jc w:val="center"/>
+          </w:pPr>
+          <w:r>
+            <w:t>{c1_no}</w:t>
+          </w:r>
+        </w:p>
+        <w:p>
+          <w:pPr>
+            <w:jc w:val="center"/>
+          </w:pPr>
+          <w:r>
+            <w:t>{c1_yes}</w:t>
+          </w:r>
+        </w:p>
         <w:tc>
           <w:tcPr>
             <w:tcW w:w="3298" w:type="dxa"/>
@@ -2644,78 +2588,22 @@
         <w:trPr>
           <w:trHeight w:val="482"/>
         </w:trPr>
-        <w:sdt>
-          <w:sdtPr>
-            <w:rPr>
-              <w:u w:val="single"/>
-            </w:rPr>
-            <w:id w:val="-1042125492"/>
-            <w14:checkbox>
-              <w14:checked w14:val="0"/>
-              <w14:checkedState w14:val="2612" w14:font="MS Gothic"/>
-              <w14:uncheckedState w14:val="2610" w14:font="MS Gothic"/>
-            </w14:checkbox>
-          </w:sdtPr>
-          <w:sdtContent>
-            <w:tc>
-              <w:tcPr>
-                <w:tcW w:w="1546" w:type="dxa"/>
-              </w:tcPr>
-              <w:p>
-                <w:pPr>
-                  <w:jc w:val="center"/>
-                  <w:rPr>
-                    <w:u w:val="single"/>
-                    <w:rtl/>
-                  </w:rPr>
-                </w:pPr>
-                <w:r>
-                  <w:rPr>
-                    <w:rFonts w:ascii="MS Gothic" w:eastAsia="MS Gothic" w:hAnsi="MS Gothic" w:hint="eastAsia"/>
-                    <w:u w:val="single"/>
-                  </w:rPr>
-                  <w:t>☐</w:t>
-                </w:r>
-              </w:p>
-            </w:tc>
-          </w:sdtContent>
-        </w:sdt>
-        <w:sdt>
-          <w:sdtPr>
-            <w:rPr>
-              <w:u w:val="single"/>
-            </w:rPr>
-            <w:id w:val="-218514666"/>
-            <w14:checkbox>
-              <w14:checked w14:val="0"/>
-              <w14:checkedState w14:val="2612" w14:font="MS Gothic"/>
-              <w14:uncheckedState w14:val="2610" w14:font="MS Gothic"/>
-            </w14:checkbox>
-          </w:sdtPr>
-          <w:sdtContent>
-            <w:tc>
-              <w:tcPr>
-                <w:tcW w:w="1823" w:type="dxa"/>
-              </w:tcPr>
-              <w:p>
-                <w:pPr>
-                  <w:jc w:val="center"/>
-                  <w:rPr>
-                    <w:u w:val="single"/>
-                    <w:rtl/>
-                  </w:rPr>
-                </w:pPr>
-                <w:r>
-                  <w:rPr>
-                    <w:rFonts w:ascii="MS Gothic" w:eastAsia="MS Gothic" w:hAnsi="MS Gothic" w:hint="eastAsia"/>
-                    <w:u w:val="single"/>
-                  </w:rPr>
-                  <w:t>☐</w:t>
-                </w:r>
-              </w:p>
-            </w:tc>
-          </w:sdtContent>
-        </w:sdt>
+        <w:p>
+          <w:pPr>
+            <w:jc w:val="center"/>
+          </w:pPr>
+          <w:r>
+            <w:t>{c2_no}</w:t>
+          </w:r>
+        </w:p>
+        <w:p>
+          <w:pPr>
+            <w:jc w:val="center"/>
+          </w:pPr>
+          <w:r>
+            <w:t>{c2_yes}</w:t>
+          </w:r>
+        </w:p>
         <w:tc>
           <w:tcPr>
             <w:tcW w:w="3298" w:type="dxa"/>
@@ -2773,78 +2661,22 @@
         <w:trPr>
           <w:trHeight w:val="425"/>
         </w:trPr>
-        <w:sdt>
-          <w:sdtPr>
-            <w:rPr>
-              <w:u w:val="single"/>
-            </w:rPr>
-            <w:id w:val="1389992244"/>
-            <w14:checkbox>
-              <w14:checked w14:val="0"/>
-              <w14:checkedState w14:val="2612" w14:font="MS Gothic"/>
-              <w14:uncheckedState w14:val="2610" w14:font="MS Gothic"/>
-            </w14:checkbox>
-          </w:sdtPr>
-          <w:sdtContent>
-            <w:tc>
-              <w:tcPr>
-                <w:tcW w:w="1546" w:type="dxa"/>
-              </w:tcPr>
-              <w:p>
-                <w:pPr>
-                  <w:jc w:val="center"/>
-                  <w:rPr>
-                    <w:u w:val="single"/>
-                    <w:rtl/>
-                  </w:rPr>
-                </w:pPr>
-                <w:r>
-                  <w:rPr>
-                    <w:rFonts w:ascii="MS Gothic" w:eastAsia="MS Gothic" w:hAnsi="MS Gothic" w:hint="eastAsia"/>
-                    <w:u w:val="single"/>
-                  </w:rPr>
-                  <w:t>☐</w:t>
-                </w:r>
-              </w:p>
-            </w:tc>
-          </w:sdtContent>
-        </w:sdt>
-        <w:sdt>
-          <w:sdtPr>
-            <w:rPr>
-              <w:u w:val="single"/>
-            </w:rPr>
-            <w:id w:val="-1337297603"/>
-            <w14:checkbox>
-              <w14:checked w14:val="0"/>
-              <w14:checkedState w14:val="2612" w14:font="MS Gothic"/>
-              <w14:uncheckedState w14:val="2610" w14:font="MS Gothic"/>
-            </w14:checkbox>
-          </w:sdtPr>
-          <w:sdtContent>
-            <w:tc>
-              <w:tcPr>
-                <w:tcW w:w="1823" w:type="dxa"/>
-              </w:tcPr>
-              <w:p>
-                <w:pPr>
-                  <w:jc w:val="center"/>
-                  <w:rPr>
-                    <w:u w:val="single"/>
-                    <w:rtl/>
-                  </w:rPr>
-                </w:pPr>
-                <w:r>
-                  <w:rPr>
-                    <w:rFonts w:ascii="MS Gothic" w:eastAsia="MS Gothic" w:hAnsi="MS Gothic" w:hint="eastAsia"/>
-                    <w:u w:val="single"/>
-                  </w:rPr>
-                  <w:t>☐</w:t>
-                </w:r>
-              </w:p>
-            </w:tc>
-          </w:sdtContent>
-        </w:sdt>
+        <w:p>
+          <w:pPr>
+            <w:jc w:val="center"/>
+          </w:pPr>
+          <w:r>
+            <w:t>{c3_no}</w:t>
+          </w:r>
+        </w:p>
+        <w:p>
+          <w:pPr>
+            <w:jc w:val="center"/>
+          </w:pPr>
+          <w:r>
+            <w:t>{c3_yes}</w:t>
+          </w:r>
+        </w:p>
         <w:tc>
           <w:tcPr>
             <w:tcW w:w="3298" w:type="dxa"/>
@@ -3028,7 +2860,7 @@
                 <w:rtl/>
                 <w:lang w:bidi="ar-MA"/>
               </w:rPr>
-              <w:t>...........................................................</w:t>
+              <w:t>{notes}</w:t>
             </w:r>
             <w:r>
               <w:rPr>
@@ -3071,7 +2903,7 @@
                 <w:rtl/>
                 <w:lang w:bidi="ar-MA"/>
               </w:rPr>
-              <w:t>...........................................................</w:t>
+              <w:t>{notes}</w:t>
             </w:r>
             <w:r>
               <w:rPr>

</xml_diff>

<commit_message>
fix: make evaluation_template.docx rots table dynamic, replace dates and clean notes dots
</commit_message>
<xml_diff>
--- a/public/evaluation_template.docx
+++ b/public/evaluation_template.docx
@@ -1072,90 +1072,21 @@
                 <w:rFonts w:cs="Samir_Khouaja_Maghribi"/>
                 <w:b/>
                 <w:bCs/>
-                <w:color w:val="000000" w:themeColor="text1"/>
-                <w:sz w:val="24"/>
-                <w:szCs w:val="24"/>
-                <w:rtl/>
-                <w:lang w:bidi="ar-MA"/>
-              </w:rPr>
-            </w:pPr>
-            <w:r>
-              <w:rPr>
-                <w:rFonts w:cs="Samir_Khouaja_Maghribi" w:hint="cs"/>
-                <w:b/>
-                <w:bCs/>
-                <w:color w:val="000000" w:themeColor="text1"/>
-                <w:sz w:val="24"/>
-                <w:szCs w:val="24"/>
-                <w:rtl/>
-                <w:lang w:bidi="ar-MA"/>
-              </w:rPr>
-              <w:t xml:space="preserve">من: </w:t>
-            </w:r>
-            <w:r>
-              <w:rPr>
-                <w:rFonts w:cs="Samir_Khouaja_Maghribi" w:hint="cs"/>
-                <w:b/>
-                <w:bCs/>
-                <w:color w:val="000000" w:themeColor="text1"/>
-                <w:sz w:val="24"/>
-                <w:szCs w:val="24"/>
-                <w:rtl/>
-                <w:lang w:bidi="ar-MA"/>
-              </w:rPr>
-              <w:t>03</w:t>
-            </w:r>
-            <w:r>
-              <w:rPr>
-                <w:rFonts w:cs="Samir_Khouaja_Maghribi" w:hint="cs"/>
-                <w:b/>
-                <w:bCs/>
-                <w:color w:val="000000" w:themeColor="text1"/>
-                <w:sz w:val="24"/>
-                <w:szCs w:val="24"/>
-                <w:rtl/>
-                <w:lang w:bidi="ar-MA"/>
-              </w:rPr>
-              <w:t>/</w:t>
-            </w:r>
-            <w:r>
-              <w:rPr>
-                <w:rFonts w:cs="Samir_Khouaja_Maghribi" w:hint="cs"/>
-                <w:b/>
-                <w:bCs/>
-                <w:color w:val="000000" w:themeColor="text1"/>
-                <w:sz w:val="24"/>
-                <w:szCs w:val="24"/>
-                <w:rtl/>
-                <w:lang w:bidi="ar-MA"/>
-              </w:rPr>
-              <w:t>11</w:t>
-            </w:r>
-            <w:r>
-              <w:rPr>
-                <w:rFonts w:cs="Samir_Khouaja_Maghribi" w:hint="cs"/>
-                <w:b/>
-                <w:bCs/>
-                <w:color w:val="000000" w:themeColor="text1"/>
-                <w:sz w:val="24"/>
-                <w:szCs w:val="24"/>
-                <w:rtl/>
-                <w:lang w:bidi="ar-MA"/>
-              </w:rPr>
-              <w:t>/</w:t>
-            </w:r>
-            <w:r>
-              <w:rPr>
-                <w:rFonts w:cs="Samir_Khouaja_Maghribi" w:hint="cs"/>
-                <w:b/>
-                <w:bCs/>
-                <w:color w:val="000000" w:themeColor="text1"/>
-                <w:sz w:val="24"/>
-                <w:szCs w:val="24"/>
-                <w:rtl/>
-                <w:lang w:bidi="ar-MA"/>
-              </w:rPr>
-              <w:t>2025</w:t>
+                <w:sz w:val="24"/>
+                <w:szCs w:val="24"/>
+                <w:rtl/>
+              </w:rPr>
+            </w:pPr>
+            <w:r>
+              <w:rPr>
+                <w:rFonts w:cs="Samir_Khouaja_Maghribi"/>
+                <w:b/>
+                <w:bCs/>
+                <w:sz w:val="24"/>
+                <w:szCs w:val="24"/>
+                <w:rtl/>
+              </w:rPr>
+              <w:t xml:space="preserve">من: {from}</w:t>
             </w:r>
           </w:p>
           <w:p>
@@ -1180,76 +1111,21 @@
                 <w:rFonts w:cs="Samir_Khouaja_Maghribi"/>
                 <w:b/>
                 <w:bCs/>
-                <w:color w:val="000000" w:themeColor="text1"/>
-                <w:sz w:val="24"/>
-                <w:szCs w:val="24"/>
-                <w:lang w:bidi="ar-MA"/>
-              </w:rPr>
-            </w:pPr>
-            <w:r>
-              <w:rPr>
-                <w:rFonts w:cs="Samir_Khouaja_Maghribi" w:hint="cs"/>
-                <w:b/>
-                <w:bCs/>
-                <w:color w:val="000000" w:themeColor="text1"/>
-                <w:sz w:val="24"/>
-                <w:szCs w:val="24"/>
-                <w:rtl/>
-                <w:lang w:bidi="ar-MA"/>
-              </w:rPr>
-              <w:t xml:space="preserve">إلى: </w:t>
-            </w:r>
-            <w:r>
-              <w:rPr>
-                <w:rFonts w:cs="Samir_Khouaja_Maghribi" w:hint="cs"/>
-                <w:b/>
-                <w:bCs/>
-                <w:color w:val="000000" w:themeColor="text1"/>
-                <w:sz w:val="24"/>
-                <w:szCs w:val="24"/>
-                <w:rtl/>
-                <w:lang w:bidi="ar-MA"/>
-              </w:rPr>
-              <w:t>30</w:t>
-            </w:r>
-            <w:r>
-              <w:rPr>
-                <w:rFonts w:cs="Samir_Khouaja_Maghribi" w:hint="cs"/>
-                <w:b/>
-                <w:bCs/>
-                <w:color w:val="000000" w:themeColor="text1"/>
-                <w:sz w:val="24"/>
-                <w:szCs w:val="24"/>
-                <w:rtl/>
-                <w:lang w:bidi="ar-MA"/>
-              </w:rPr>
-              <w:t>/</w:t>
-            </w:r>
-            <w:r>
-              <w:rPr>
-                <w:rFonts w:cs="Samir_Khouaja_Maghribi" w:hint="cs"/>
-                <w:b/>
-                <w:bCs/>
-                <w:color w:val="000000" w:themeColor="text1"/>
-                <w:sz w:val="24"/>
-                <w:szCs w:val="24"/>
-                <w:rtl/>
-                <w:lang w:bidi="ar-MA"/>
-              </w:rPr>
-              <w:t>04</w:t>
-            </w:r>
-            <w:r>
-              <w:rPr>
-                <w:rFonts w:cs="Samir_Khouaja_Maghribi" w:hint="cs"/>
-                <w:b/>
-                <w:bCs/>
-                <w:color w:val="000000" w:themeColor="text1"/>
-                <w:sz w:val="24"/>
-                <w:szCs w:val="24"/>
-                <w:rtl/>
-                <w:lang w:bidi="ar-MA"/>
-              </w:rPr>
-              <w:t>/2026</w:t>
+                <w:sz w:val="24"/>
+                <w:szCs w:val="24"/>
+                <w:rtl/>
+              </w:rPr>
+            </w:pPr>
+            <w:r>
+              <w:rPr>
+                <w:rFonts w:cs="Samir_Khouaja_Maghribi"/>
+                <w:b/>
+                <w:bCs/>
+                <w:sz w:val="24"/>
+                <w:szCs w:val="24"/>
+                <w:rtl/>
+              </w:rPr>
+              <w:t xml:space="preserve">إلى: {to}</w:t>
             </w:r>
           </w:p>
           <w:p/>
@@ -1382,36 +1258,12 @@
             </w:pPr>
             <w:r>
               <w:rPr>
-                <w:rFonts w:hint="cs"/>
-                <w:b/>
-                <w:bCs/>
-                <w:rtl/>
-              </w:rPr>
-              <w:t>المشرف على</w:t>
-            </w:r>
-            <w:r>
-              <w:rPr>
-                <w:rFonts w:hint="cs"/>
-                <w:rtl/>
-              </w:rPr>
-              <w:t xml:space="preserve"> </w:t>
-            </w:r>
-            <w:r>
-              <w:rPr>
-                <w:rFonts w:hint="cs"/>
-                <w:b/>
-                <w:bCs/>
-                <w:rtl/>
-              </w:rPr>
-              <w:t>التكوين</w:t>
-            </w:r>
-          </w:p>
-          <w:p>
-            <w:pPr>
-              <w:rPr>
-                <w:rtl/>
-              </w:rPr>
-            </w:pPr>
+                <w:b/>
+                <w:bCs/>
+                <w:rtl/>
+              </w:rPr>
+              <w:t>{#rots}المشرف على التكوين</w:t>
+            </w:r>
           </w:p>
           <w:p>
             <w:pPr>
@@ -1419,10 +1271,9 @@
             </w:pPr>
             <w:r>
               <w:rPr>
-                <w:rFonts w:hint="cs"/>
-                <w:rtl/>
-              </w:rPr>
-              <w:t>{sup1}</w:t>
+                <w:rtl/>
+              </w:rPr>
+              <w:t>{supervisor}</w:t>
             </w:r>
           </w:p>
         </w:tc>
@@ -1442,7 +1293,6 @@
             </w:pPr>
             <w:r>
               <w:rPr>
-                <w:rFonts w:hint="cs"/>
                 <w:b/>
                 <w:bCs/>
                 <w:rtl/>
@@ -1452,21 +1302,13 @@
           </w:p>
           <w:p>
             <w:pPr>
-              <w:rPr>
-                <w:rtl/>
-              </w:rPr>
-            </w:pPr>
-          </w:p>
-          <w:p>
-            <w:pPr>
               <w:jc w:val="center"/>
             </w:pPr>
             <w:r>
               <w:rPr>
-                <w:rFonts w:hint="cs"/>
-                <w:rtl/>
-              </w:rPr>
-              <w:t>{dep1}</w:t>
+                <w:rtl/>
+              </w:rPr>
+              <w:t>{department}</w:t>
             </w:r>
           </w:p>
         </w:tc>
@@ -1486,26 +1328,15 @@
             </w:pPr>
             <w:r>
               <w:rPr>
-                <w:rFonts w:hint="cs"/>
-                <w:b/>
-                <w:bCs/>
-                <w:rtl/>
-              </w:rPr>
-              <w:t xml:space="preserve">الفترة </w:t>
-            </w:r>
-            <w:r>
-              <w:rPr>
-                <w:rFonts w:hint="cs"/>
-                <w:b/>
-                <w:bCs/>
-                <w:rtl/>
-              </w:rPr>
-              <w:t>1</w:t>
-            </w:r>
-          </w:p>
-          <w:p>
-            <w:pPr>
-              <w:spacing w:line="360" w:lineRule="auto"/>
+                <w:b/>
+                <w:bCs/>
+                <w:rtl/>
+              </w:rPr>
+              <w:t xml:space="preserve">الفترة {num}</w:t>
+            </w:r>
+          </w:p>
+          <w:p>
+            <w:pPr>
               <w:jc w:val="center"/>
               <w:rPr>
                 <w:rtl/>
@@ -1513,845 +1344,9 @@
             </w:pPr>
             <w:r>
               <w:rPr>
-                <w:rFonts w:hint="cs"/>
-                <w:rtl/>
-              </w:rPr>
-              <w:t>من:</w:t>
-            </w:r>
-            <w:r>
-              <w:rPr>
-                <w:rFonts w:hint="cs"/>
-                <w:rtl/>
-                <w:lang w:bidi="ar-MA"/>
-              </w:rPr>
-              <w:t xml:space="preserve"> </w:t>
-            </w:r>
-            <w:r>
-              <w:rPr>
-                <w:rFonts w:hint="cs"/>
-                <w:rtl/>
-              </w:rPr>
-              <w:t>03</w:t>
-            </w:r>
-            <w:r>
-              <w:rPr>
-                <w:rFonts w:hint="cs"/>
-                <w:rtl/>
-              </w:rPr>
-              <w:t>/</w:t>
-            </w:r>
-            <w:r>
-              <w:rPr>
-                <w:rFonts w:hint="cs"/>
-                <w:rtl/>
-              </w:rPr>
-              <w:t>11</w:t>
-            </w:r>
-            <w:r>
-              <w:rPr>
-                <w:rFonts w:hint="cs"/>
-                <w:rtl/>
-              </w:rPr>
-              <w:t xml:space="preserve">/2025 إلى: </w:t>
-            </w:r>
-            <w:r>
-              <w:rPr>
-                <w:rFonts w:hint="cs"/>
-                <w:rtl/>
-              </w:rPr>
-              <w:t>28</w:t>
-            </w:r>
-            <w:r>
-              <w:rPr>
-                <w:rFonts w:hint="cs"/>
-                <w:rtl/>
-              </w:rPr>
-              <w:t>/</w:t>
-            </w:r>
-            <w:r>
-              <w:rPr>
-                <w:rFonts w:hint="cs"/>
-                <w:rtl/>
-              </w:rPr>
-              <w:t>11</w:t>
-            </w:r>
-            <w:r>
-              <w:rPr>
-                <w:rFonts w:hint="cs"/>
-                <w:rtl/>
-              </w:rPr>
-              <w:t>/2025</w:t>
-            </w:r>
-          </w:p>
-        </w:tc>
-      </w:tr>
-      <w:tr>
-        <w:trPr>
-          <w:trHeight w:val="855"/>
-        </w:trPr>
-        <w:tc>
-          <w:tcPr>
-            <w:tcW w:w="3369" w:type="dxa"/>
-            <w:gridSpan w:val="2"/>
-          </w:tcPr>
-          <w:p>
-            <w:pPr>
-              <w:jc w:val="center"/>
-              <w:rPr>
-                <w:b/>
-                <w:bCs/>
-                <w:rtl/>
-              </w:rPr>
-            </w:pPr>
-            <w:r>
-              <w:rPr>
-                <w:rFonts w:hint="cs"/>
-                <w:b/>
-                <w:bCs/>
-                <w:rtl/>
-              </w:rPr>
-              <w:t>المشرف على</w:t>
-            </w:r>
-            <w:r>
-              <w:rPr>
-                <w:rFonts w:hint="cs"/>
-                <w:rtl/>
-              </w:rPr>
-              <w:t xml:space="preserve"> </w:t>
-            </w:r>
-            <w:r>
-              <w:rPr>
-                <w:rFonts w:hint="cs"/>
-                <w:b/>
-                <w:bCs/>
-                <w:rtl/>
-              </w:rPr>
-              <w:t>التكوين</w:t>
-            </w:r>
-          </w:p>
-          <w:p>
-            <w:pPr>
-              <w:rPr>
-                <w:rtl/>
-              </w:rPr>
-            </w:pPr>
-          </w:p>
-          <w:p>
-            <w:pPr>
-              <w:jc w:val="center"/>
-            </w:pPr>
-            <w:r>
-              <w:rPr>
-                <w:rFonts w:hint="cs"/>
-                <w:rtl/>
-              </w:rPr>
-              <w:t>{sup2}</w:t>
-            </w:r>
-          </w:p>
-        </w:tc>
-        <w:tc>
-          <w:tcPr>
-            <w:tcW w:w="3298" w:type="dxa"/>
-            <w:gridSpan w:val="3"/>
-          </w:tcPr>
-          <w:p>
-            <w:pPr>
-              <w:jc w:val="center"/>
-              <w:rPr>
-                <w:b/>
-                <w:bCs/>
-                <w:rtl/>
-              </w:rPr>
-            </w:pPr>
-            <w:r>
-              <w:rPr>
-                <w:rFonts w:hint="cs"/>
-                <w:b/>
-                <w:bCs/>
-                <w:rtl/>
-              </w:rPr>
-              <w:t>الشعبة</w:t>
-            </w:r>
-          </w:p>
-          <w:p>
-            <w:pPr>
-              <w:rPr>
-                <w:rtl/>
-              </w:rPr>
-            </w:pPr>
-          </w:p>
-          <w:p>
-            <w:pPr>
-              <w:jc w:val="center"/>
-            </w:pPr>
-            <w:r>
-              <w:rPr>
-                <w:rFonts w:hint="cs"/>
-                <w:rtl/>
-              </w:rPr>
-              <w:t>{dep2}</w:t>
-            </w:r>
-          </w:p>
-        </w:tc>
-        <w:tc>
-          <w:tcPr>
-            <w:tcW w:w="3294" w:type="dxa"/>
-            <w:gridSpan w:val="2"/>
-          </w:tcPr>
-          <w:p>
-            <w:pPr>
-              <w:jc w:val="center"/>
-              <w:rPr>
-                <w:b/>
-                <w:bCs/>
-                <w:rtl/>
-              </w:rPr>
-            </w:pPr>
-            <w:r>
-              <w:rPr>
-                <w:rFonts w:hint="cs"/>
-                <w:b/>
-                <w:bCs/>
-                <w:rtl/>
-              </w:rPr>
-              <w:t>الفترة</w:t>
-            </w:r>
-            <w:r>
-              <w:rPr>
-                <w:rFonts w:hint="cs"/>
-                <w:b/>
-                <w:bCs/>
-                <w:rtl/>
-              </w:rPr>
-              <w:t xml:space="preserve"> 2</w:t>
-            </w:r>
-          </w:p>
-          <w:p>
-            <w:pPr>
-              <w:spacing w:line="360" w:lineRule="auto"/>
-              <w:jc w:val="center"/>
-            </w:pPr>
-            <w:r>
-              <w:rPr>
-                <w:rFonts w:hint="cs"/>
-                <w:rtl/>
-              </w:rPr>
-              <w:t>من:</w:t>
-            </w:r>
-            <w:r>
-              <w:rPr>
-                <w:rFonts w:hint="cs"/>
-                <w:rtl/>
-                <w:lang w:bidi="ar-MA"/>
-              </w:rPr>
-              <w:t xml:space="preserve"> </w:t>
-            </w:r>
-            <w:r>
-              <w:rPr>
-                <w:rFonts w:hint="cs"/>
-                <w:rtl/>
-              </w:rPr>
-              <w:t>01</w:t>
-            </w:r>
-            <w:r>
-              <w:rPr>
-                <w:rFonts w:hint="cs"/>
-                <w:rtl/>
-              </w:rPr>
-              <w:t>/</w:t>
-            </w:r>
-            <w:r>
-              <w:rPr>
-                <w:rFonts w:hint="cs"/>
-                <w:rtl/>
-              </w:rPr>
-              <w:t>12</w:t>
-            </w:r>
-            <w:r>
-              <w:rPr>
-                <w:rFonts w:hint="cs"/>
-                <w:rtl/>
-              </w:rPr>
-              <w:t>/</w:t>
-            </w:r>
-            <w:r>
-              <w:rPr>
-                <w:rFonts w:hint="cs"/>
-                <w:rtl/>
-              </w:rPr>
-              <w:t>2025</w:t>
-            </w:r>
-            <w:r>
-              <w:rPr>
-                <w:rFonts w:hint="cs"/>
-                <w:rtl/>
-              </w:rPr>
-              <w:t xml:space="preserve"> إلى: </w:t>
-            </w:r>
-            <w:r>
-              <w:rPr>
-                <w:rFonts w:hint="cs"/>
-                <w:rtl/>
-              </w:rPr>
-              <w:t>31</w:t>
-            </w:r>
-            <w:r>
-              <w:rPr>
-                <w:rFonts w:hint="cs"/>
-                <w:rtl/>
-              </w:rPr>
-              <w:t>/</w:t>
-            </w:r>
-            <w:r>
-              <w:rPr>
-                <w:rFonts w:hint="cs"/>
-                <w:rtl/>
-              </w:rPr>
-              <w:t>12</w:t>
-            </w:r>
-            <w:r>
-              <w:rPr>
-                <w:rFonts w:hint="cs"/>
-                <w:rtl/>
-              </w:rPr>
-              <w:t>/</w:t>
-            </w:r>
-            <w:r>
-              <w:rPr>
-                <w:rFonts w:hint="cs"/>
-                <w:rtl/>
-              </w:rPr>
-              <w:t>2025</w:t>
-            </w:r>
-          </w:p>
-        </w:tc>
-      </w:tr>
-      <w:tr>
-        <w:trPr>
-          <w:trHeight w:val="921"/>
-        </w:trPr>
-        <w:tc>
-          <w:tcPr>
-            <w:tcW w:w="3369" w:type="dxa"/>
-            <w:gridSpan w:val="2"/>
-          </w:tcPr>
-          <w:p>
-            <w:pPr>
-              <w:jc w:val="center"/>
-              <w:rPr>
-                <w:b/>
-                <w:bCs/>
-                <w:rtl/>
-              </w:rPr>
-            </w:pPr>
-            <w:r>
-              <w:rPr>
-                <w:rFonts w:hint="cs"/>
-                <w:b/>
-                <w:bCs/>
-                <w:rtl/>
-              </w:rPr>
-              <w:t>المشرف على</w:t>
-            </w:r>
-            <w:r>
-              <w:rPr>
-                <w:rFonts w:hint="cs"/>
-                <w:rtl/>
-              </w:rPr>
-              <w:t xml:space="preserve"> </w:t>
-            </w:r>
-            <w:r>
-              <w:rPr>
-                <w:rFonts w:hint="cs"/>
-                <w:b/>
-                <w:bCs/>
-                <w:rtl/>
-              </w:rPr>
-              <w:t>التكوين</w:t>
-            </w:r>
-          </w:p>
-          <w:p>
-            <w:pPr>
-              <w:jc w:val="center"/>
-              <w:rPr>
-                <w:b/>
-                <w:bCs/>
-                <w:rtl/>
-              </w:rPr>
-            </w:pPr>
-          </w:p>
-          <w:p>
-            <w:pPr>
-              <w:jc w:val="center"/>
-            </w:pPr>
-            <w:r>
-              <w:rPr>
-                <w:rFonts w:hint="cs"/>
-                <w:rtl/>
-              </w:rPr>
-              <w:t xml:space="preserve">الأستاذ </w:t>
-            </w:r>
-            <w:r>
-              <w:rPr>
-                <w:rFonts w:hint="cs"/>
-                <w:rtl/>
-              </w:rPr>
-              <w:t>{sup3}</w:t>
-            </w:r>
-          </w:p>
-        </w:tc>
-        <w:tc>
-          <w:tcPr>
-            <w:tcW w:w="3298" w:type="dxa"/>
-            <w:gridSpan w:val="3"/>
-          </w:tcPr>
-          <w:p>
-            <w:pPr>
-              <w:jc w:val="center"/>
-              <w:rPr>
-                <w:b/>
-                <w:bCs/>
-                <w:rtl/>
-              </w:rPr>
-            </w:pPr>
-            <w:r>
-              <w:rPr>
-                <w:rFonts w:hint="cs"/>
-                <w:b/>
-                <w:bCs/>
-                <w:rtl/>
-              </w:rPr>
-              <w:t>الشعبة</w:t>
-            </w:r>
-          </w:p>
-          <w:p>
-            <w:pPr>
-              <w:jc w:val="center"/>
-              <w:rPr>
-                <w:b/>
-                <w:bCs/>
-                <w:rtl/>
-              </w:rPr>
-            </w:pPr>
-          </w:p>
-          <w:p>
-            <w:pPr>
-              <w:jc w:val="center"/>
-            </w:pPr>
-            <w:r>
-              <w:rPr>
-                <w:rFonts w:hint="cs"/>
-                <w:rtl/>
-              </w:rPr>
-              <w:t xml:space="preserve">{dep3} </w:t>
-            </w:r>
-          </w:p>
-        </w:tc>
-        <w:tc>
-          <w:tcPr>
-            <w:tcW w:w="3294" w:type="dxa"/>
-            <w:gridSpan w:val="2"/>
-          </w:tcPr>
-          <w:p>
-            <w:pPr>
-              <w:jc w:val="center"/>
-              <w:rPr>
-                <w:b/>
-                <w:bCs/>
-                <w:rtl/>
-              </w:rPr>
-            </w:pPr>
-            <w:r>
-              <w:rPr>
-                <w:rFonts w:hint="cs"/>
-                <w:b/>
-                <w:bCs/>
-                <w:rtl/>
-              </w:rPr>
-              <w:t xml:space="preserve">الفترة </w:t>
-            </w:r>
-            <w:r>
-              <w:rPr>
-                <w:rFonts w:hint="cs"/>
-                <w:b/>
-                <w:bCs/>
-                <w:rtl/>
-              </w:rPr>
-              <w:t>3</w:t>
-            </w:r>
-          </w:p>
-          <w:p>
-            <w:pPr>
-              <w:spacing w:line="360" w:lineRule="auto"/>
-              <w:jc w:val="center"/>
-            </w:pPr>
-            <w:r>
-              <w:rPr>
-                <w:rFonts w:hint="cs"/>
-                <w:rtl/>
-              </w:rPr>
-              <w:t>من:</w:t>
-            </w:r>
-            <w:r>
-              <w:rPr>
-                <w:rFonts w:hint="cs"/>
-                <w:rtl/>
-                <w:lang w:bidi="ar-MA"/>
-              </w:rPr>
-              <w:t xml:space="preserve"> </w:t>
-            </w:r>
-            <w:r>
-              <w:rPr>
-                <w:rFonts w:hint="cs"/>
-                <w:rtl/>
-              </w:rPr>
-              <w:t>02</w:t>
-            </w:r>
-            <w:r>
-              <w:rPr>
-                <w:rFonts w:hint="cs"/>
-                <w:rtl/>
-              </w:rPr>
-              <w:t>/</w:t>
-            </w:r>
-            <w:r>
-              <w:rPr>
-                <w:rFonts w:hint="cs"/>
-                <w:rtl/>
-              </w:rPr>
-              <w:t>01</w:t>
-            </w:r>
-            <w:r>
-              <w:rPr>
-                <w:rFonts w:hint="cs"/>
-                <w:rtl/>
-              </w:rPr>
-              <w:t>/</w:t>
-            </w:r>
-            <w:r>
-              <w:rPr>
-                <w:rFonts w:hint="cs"/>
-                <w:rtl/>
-              </w:rPr>
-              <w:t>2026</w:t>
-            </w:r>
-            <w:r>
-              <w:rPr>
-                <w:rFonts w:hint="cs"/>
-                <w:rtl/>
-              </w:rPr>
-              <w:t xml:space="preserve"> إلى: </w:t>
-            </w:r>
-            <w:r>
-              <w:rPr>
-                <w:rFonts w:hint="cs"/>
-                <w:rtl/>
-              </w:rPr>
-              <w:t>10</w:t>
-            </w:r>
-            <w:r>
-              <w:rPr>
-                <w:rFonts w:hint="cs"/>
-                <w:rtl/>
-              </w:rPr>
-              <w:t>/</w:t>
-            </w:r>
-            <w:r>
-              <w:rPr>
-                <w:rFonts w:hint="cs"/>
-                <w:rtl/>
-              </w:rPr>
-              <w:t>04</w:t>
-            </w:r>
-            <w:r>
-              <w:rPr>
-                <w:rFonts w:hint="cs"/>
-                <w:rtl/>
-              </w:rPr>
-              <w:t>/</w:t>
-            </w:r>
-            <w:r>
-              <w:rPr>
-                <w:rFonts w:hint="cs"/>
-                <w:rtl/>
-              </w:rPr>
-              <w:t>2026</w:t>
-            </w:r>
-          </w:p>
-        </w:tc>
-      </w:tr>
-      <w:tr>
-        <w:trPr>
-          <w:trHeight w:val="921"/>
-        </w:trPr>
-        <w:tc>
-          <w:tcPr>
-            <w:tcW w:w="3369" w:type="dxa"/>
-            <w:gridSpan w:val="2"/>
-          </w:tcPr>
-          <w:p>
-            <w:pPr>
-              <w:jc w:val="center"/>
-              <w:rPr>
-                <w:b/>
-                <w:bCs/>
-                <w:rtl/>
-              </w:rPr>
-            </w:pPr>
-            <w:r>
-              <w:rPr>
-                <w:rFonts w:hint="cs"/>
-                <w:b/>
-                <w:bCs/>
-                <w:rtl/>
-              </w:rPr>
-              <w:t>المشرف على</w:t>
-            </w:r>
-            <w:r>
-              <w:rPr>
-                <w:rFonts w:hint="cs"/>
-                <w:rtl/>
-              </w:rPr>
-              <w:t xml:space="preserve"> </w:t>
-            </w:r>
-            <w:r>
-              <w:rPr>
-                <w:rFonts w:hint="cs"/>
-                <w:b/>
-                <w:bCs/>
-                <w:rtl/>
-              </w:rPr>
-              <w:t>التكوين</w:t>
-            </w:r>
-          </w:p>
-          <w:p>
-            <w:pPr>
-              <w:rPr>
-                <w:rtl/>
-              </w:rPr>
-            </w:pPr>
-          </w:p>
-          <w:p>
-            <w:pPr>
-              <w:jc w:val="center"/>
-              <w:rPr>
-                <w:b/>
-                <w:bCs/>
-                <w:rtl/>
-              </w:rPr>
-            </w:pPr>
-            <w:r>
-              <w:rPr>
-                <w:rFonts w:hint="cs"/>
-                <w:rtl/>
-              </w:rPr>
-              <w:t xml:space="preserve">الأستاذ </w:t>
-            </w:r>
-            <w:r>
-              <w:rPr>
-                <w:rFonts w:hint="cs"/>
-                <w:rtl/>
-              </w:rPr>
-              <w:t>{sup4}</w:t>
-            </w:r>
-            <w:r>
-              <w:rPr>
-                <w:rFonts w:hint="cs"/>
-                <w:rtl/>
-              </w:rPr>
-              <w:t xml:space="preserve"> </w:t>
-            </w:r>
-          </w:p>
-        </w:tc>
-        <w:tc>
-          <w:tcPr>
-            <w:tcW w:w="3298" w:type="dxa"/>
-            <w:gridSpan w:val="3"/>
-          </w:tcPr>
-          <w:p>
-            <w:pPr>
-              <w:jc w:val="center"/>
-              <w:rPr>
-                <w:b/>
-                <w:bCs/>
-                <w:rtl/>
-              </w:rPr>
-            </w:pPr>
-            <w:r>
-              <w:rPr>
-                <w:rFonts w:hint="cs"/>
-                <w:b/>
-                <w:bCs/>
-                <w:rtl/>
-              </w:rPr>
-              <w:t>الشعبة</w:t>
-            </w:r>
-          </w:p>
-          <w:p>
-            <w:pPr>
-              <w:rPr>
-                <w:rtl/>
-              </w:rPr>
-            </w:pPr>
-          </w:p>
-          <w:p>
-            <w:pPr>
-              <w:jc w:val="center"/>
-              <w:rPr>
-                <w:b/>
-                <w:bCs/>
-                <w:rtl/>
-              </w:rPr>
-            </w:pPr>
-            <w:r>
-              <w:rPr>
-                <w:rFonts w:hint="cs"/>
-                <w:rtl/>
-              </w:rPr>
-              <w:t>ال</w:t>
-            </w:r>
-            <w:r>
-              <w:rPr>
-                <w:rFonts w:hint="cs"/>
-                <w:rtl/>
-              </w:rPr>
-              <w:t>خبرة والمسح الضوئي</w:t>
-            </w:r>
-          </w:p>
-        </w:tc>
-        <w:tc>
-          <w:tcPr>
-            <w:tcW w:w="3294" w:type="dxa"/>
-            <w:gridSpan w:val="2"/>
-          </w:tcPr>
-          <w:p>
-            <w:pPr>
-              <w:jc w:val="center"/>
-              <w:rPr>
-                <w:b/>
-                <w:bCs/>
-                <w:rtl/>
-              </w:rPr>
-            </w:pPr>
-            <w:r>
-              <w:rPr>
-                <w:rFonts w:hint="cs"/>
-                <w:b/>
-                <w:bCs/>
-                <w:rtl/>
-              </w:rPr>
-              <w:t xml:space="preserve">الفترة </w:t>
-            </w:r>
-            <w:r>
-              <w:rPr>
-                <w:rFonts w:hint="cs"/>
-                <w:b/>
-                <w:bCs/>
-                <w:rtl/>
-              </w:rPr>
-              <w:t>4</w:t>
-            </w:r>
-          </w:p>
-          <w:p>
-            <w:pPr>
-              <w:jc w:val="center"/>
-              <w:rPr>
-                <w:b/>
-                <w:bCs/>
-                <w:rtl/>
-              </w:rPr>
-            </w:pPr>
-            <w:r>
-              <w:rPr>
-                <w:rFonts w:hint="cs"/>
-                <w:rtl/>
-              </w:rPr>
-              <w:t>من:</w:t>
-            </w:r>
-            <w:r>
-              <w:rPr>
-                <w:rFonts w:hint="cs"/>
-                <w:rtl/>
-                <w:lang w:bidi="ar-MA"/>
-              </w:rPr>
-              <w:t xml:space="preserve"> </w:t>
-            </w:r>
-            <w:r>
-              <w:rPr>
-                <w:rFonts w:hint="cs"/>
-                <w:rtl/>
-              </w:rPr>
-              <w:t>13</w:t>
-            </w:r>
-            <w:r>
-              <w:rPr>
-                <w:rFonts w:hint="cs"/>
-                <w:rtl/>
-              </w:rPr>
-              <w:t>/</w:t>
-            </w:r>
-            <w:r>
-              <w:rPr>
-                <w:rFonts w:hint="cs"/>
-                <w:rtl/>
-              </w:rPr>
-              <w:t>04</w:t>
-            </w:r>
-            <w:r>
-              <w:rPr>
-                <w:rFonts w:hint="cs"/>
-                <w:rtl/>
-              </w:rPr>
-              <w:t>/</w:t>
-            </w:r>
-            <w:r>
-              <w:rPr>
-                <w:rFonts w:hint="cs"/>
-                <w:rtl/>
-              </w:rPr>
-              <w:t>2026</w:t>
-            </w:r>
-            <w:r>
-              <w:rPr>
-                <w:rFonts w:hint="cs"/>
-                <w:rtl/>
-              </w:rPr>
-              <w:t xml:space="preserve"> إلى: </w:t>
-            </w:r>
-            <w:r>
-              <w:rPr>
-                <w:rFonts w:hint="cs"/>
-                <w:rtl/>
-              </w:rPr>
-              <w:t>30</w:t>
-            </w:r>
-            <w:r>
-              <w:rPr>
-                <w:rFonts w:hint="cs"/>
-                <w:rtl/>
-              </w:rPr>
-              <w:t>/</w:t>
-            </w:r>
-            <w:r>
-              <w:rPr>
-                <w:rFonts w:hint="cs"/>
-                <w:rtl/>
-              </w:rPr>
-              <w:t>04</w:t>
-            </w:r>
-            <w:r>
-              <w:rPr>
-                <w:rFonts w:hint="cs"/>
-                <w:rtl/>
-              </w:rPr>
-              <w:t>/</w:t>
-            </w:r>
-            <w:r>
-              <w:rPr>
-                <w:rFonts w:hint="cs"/>
-                <w:rtl/>
-              </w:rPr>
-              <w:t>2026</w:t>
+                <w:rtl/>
+              </w:rPr>
+              <w:t xml:space="preserve">من: {from} إلى: {to}{/rots}</w:t>
             </w:r>
           </w:p>
         </w:tc>
@@ -2835,6 +1830,26 @@
           </w:p>
           <w:p>
             <w:pPr>
+              <w:jc w:val="right"/>
+              <w:rPr>
+                <w:rFonts w:cs="Samir_Khouaja_Maghribi"/>
+                <w:sz w:val="24"/>
+                <w:szCs w:val="24"/>
+                <w:rtl/>
+              </w:rPr>
+            </w:pPr>
+            <w:r>
+              <w:rPr>
+                <w:rFonts w:cs="Samir_Khouaja_Maghribi"/>
+                <w:sz w:val="24"/>
+                <w:szCs w:val="24"/>
+                <w:rtl/>
+              </w:rPr>
+              <w:t>{notes}</w:t>
+            </w:r>
+          </w:p>
+          <w:p>
+            <w:pPr>
               <w:bidi/>
               <w:jc w:val="center"/>
               <w:textAlignment w:val="baseline"/>
@@ -2843,8 +1858,8 @@
                 <w:b/>
                 <w:bCs/>
                 <w:color w:val="000000" w:themeColor="text1"/>
-                <w:sz w:val="20"/>
-                <w:szCs w:val="20"/>
+                <w:sz w:val="24"/>
+                <w:szCs w:val="24"/>
                 <w:rtl/>
                 <w:lang w:bidi="ar-MA"/>
               </w:rPr>
@@ -2873,25 +1888,7 @@
                 <w:rtl/>
                 <w:lang w:bidi="ar-MA"/>
               </w:rPr>
-              <w:t>....................</w:t>
-            </w:r>
-          </w:p>
-          <w:p>
-            <w:pPr>
-              <w:bidi/>
-              <w:jc w:val="center"/>
-              <w:textAlignment w:val="baseline"/>
-              <w:rPr>
-                <w:rFonts w:cs="Samir_Khouaja_Maghribi"/>
-                <w:b/>
-                <w:bCs/>
-                <w:color w:val="000000" w:themeColor="text1"/>
-                <w:sz w:val="24"/>
-                <w:szCs w:val="24"/>
-                <w:rtl/>
-                <w:lang w:bidi="ar-MA"/>
-              </w:rPr>
-            </w:pPr>
+            </w:r>
             <w:r>
               <w:rPr>
                 <w:rFonts w:cs="Samir_Khouaja_Maghribi" w:hint="cs"/>
@@ -2903,7 +1900,7 @@
                 <w:rtl/>
                 <w:lang w:bidi="ar-MA"/>
               </w:rPr>
-              <w:t>{notes}</w:t>
+              <w:t xml:space="preserve"> ...........................................................</w:t>
             </w:r>
             <w:r>
               <w:rPr>
@@ -2916,7 +1913,6 @@
                 <w:rtl/>
                 <w:lang w:bidi="ar-MA"/>
               </w:rPr>
-              <w:t>....................</w:t>
             </w:r>
             <w:r>
               <w:rPr>
@@ -2942,7 +1938,6 @@
                 <w:rtl/>
                 <w:lang w:bidi="ar-MA"/>
               </w:rPr>
-              <w:t>....................</w:t>
             </w:r>
             <w:r>
               <w:rPr>
@@ -2968,33 +1963,6 @@
                 <w:rtl/>
                 <w:lang w:bidi="ar-MA"/>
               </w:rPr>
-              <w:t>....................</w:t>
-            </w:r>
-            <w:r>
-              <w:rPr>
-                <w:rFonts w:cs="Samir_Khouaja_Maghribi" w:hint="cs"/>
-                <w:b/>
-                <w:bCs/>
-                <w:color w:val="000000" w:themeColor="text1"/>
-                <w:sz w:val="24"/>
-                <w:szCs w:val="24"/>
-                <w:rtl/>
-                <w:lang w:bidi="ar-MA"/>
-              </w:rPr>
-              <w:t xml:space="preserve"> ...........................................................</w:t>
-            </w:r>
-            <w:r>
-              <w:rPr>
-                <w:rFonts w:cs="Samir_Khouaja_Maghribi" w:hint="cs"/>
-                <w:b/>
-                <w:bCs/>
-                <w:color w:val="000000" w:themeColor="text1"/>
-                <w:sz w:val="24"/>
-                <w:szCs w:val="24"/>
-                <w:rtl/>
-                <w:lang w:bidi="ar-MA"/>
-              </w:rPr>
-              <w:t>....................</w:t>
             </w:r>
           </w:p>
         </w:tc>

</xml_diff>

<commit_message>
feat: improve document generation and support Word files in Document Vault
- Cleaned up template generation for Evaluation and Attestation certificates.
- Perfectly aligned and formatted Arabic/French text strings in DOCX templates.
- Configured docxtemplater to generate pixel-perfect documents.
- Enabled .docx and .doc file upload support in Document Vault.
- Added custom Phosphor icons for Word documents.
- Styled vault file inputs for a premium UI experience.
</commit_message>
<xml_diff>
--- a/public/evaluation_template.docx
+++ b/public/evaluation_template.docx
@@ -1470,24 +1470,34 @@
       </w:tr>
       <w:tr>
         <w:trPr>
-          <w:trHeight w:val="408"/>
+          <w:trHeight w:val="482"/>
         </w:trPr>
-        <w:p>
-          <w:pPr>
-            <w:jc w:val="center"/>
-          </w:pPr>
-          <w:r>
-            <w:t>{c1_no}</w:t>
-          </w:r>
-        </w:p>
-        <w:p>
-          <w:pPr>
-            <w:jc w:val="center"/>
-          </w:pPr>
-          <w:r>
-            <w:t>{c1_yes}</w:t>
-          </w:r>
-        </w:p>
+        <w:tc>
+          <w:tcPr>
+            <w:tcW w:w="1546" w:type="dxa"/>
+          </w:tcPr>
+          <w:p>
+            <w:pPr>
+              <w:jc w:val="center"/>
+            </w:pPr>
+            <w:r>
+              <w:t>{c1_no}</w:t>
+            </w:r>
+          </w:p>
+        </w:tc>
+        <w:tc>
+          <w:tcPr>
+            <w:tcW w:w="1823" w:type="dxa"/>
+          </w:tcPr>
+          <w:p>
+            <w:pPr>
+              <w:jc w:val="center"/>
+            </w:pPr>
+            <w:r>
+              <w:t>{c1_yes}</w:t>
+            </w:r>
+          </w:p>
+        </w:tc>
         <w:tc>
           <w:tcPr>
             <w:tcW w:w="3298" w:type="dxa"/>
@@ -1495,30 +1505,16 @@
           </w:tcPr>
           <w:p>
             <w:pPr>
-              <w:bidi/>
-              <w:jc w:val="center"/>
-              <w:textAlignment w:val="baseline"/>
-              <w:rPr>
-                <w:rFonts w:cs="Samir_Khouaja_Maghribi"/>
-                <w:b/>
-                <w:bCs/>
-                <w:color w:val="000000" w:themeColor="text1"/>
-                <w:sz w:val="24"/>
-                <w:szCs w:val="24"/>
-                <w:rtl/>
-                <w:lang w:bidi="ar-MA"/>
-              </w:rPr>
-            </w:pPr>
-            <w:r>
-              <w:rPr>
-                <w:rFonts w:cs="Samir_Khouaja_Maghribi" w:hint="cs"/>
-                <w:b/>
-                <w:bCs/>
-                <w:color w:val="000000" w:themeColor="text1"/>
-                <w:sz w:val="24"/>
-                <w:szCs w:val="24"/>
-                <w:rtl/>
-                <w:lang w:bidi="ar-MA"/>
+              <w:jc w:val="center"/>
+              <w:rPr>
+                <w:b/>
+                <w:sz w:val="24"/>
+              </w:rPr>
+            </w:pPr>
+            <w:r>
+              <w:rPr>
+                <w:b/>
+                <w:sz w:val="24"/>
               </w:rPr>
               <w:t>المواظبة واحترام الوقت</w:t>
             </w:r>
@@ -1532,47 +1528,16 @@
           </w:tcPr>
           <w:p>
             <w:pPr>
-              <w:bidi/>
-              <w:spacing w:after="160"/>
-              <w:textAlignment w:val="baseline"/>
-              <w:rPr>
-                <w:rFonts w:cs="Samir_Khouaja_Maghribi"/>
-                <w:b/>
-                <w:bCs/>
-                <w:color w:val="000000" w:themeColor="text1"/>
-                <w:sz w:val="14"/>
-                <w:szCs w:val="14"/>
-                <w:rtl/>
-                <w:lang w:bidi="ar-MA"/>
-              </w:rPr>
-            </w:pPr>
-          </w:p>
-          <w:p>
-            <w:pPr>
-              <w:bidi/>
-              <w:spacing w:after="160"/>
-              <w:textAlignment w:val="baseline"/>
-              <w:rPr>
-                <w:rFonts w:cs="Samir_Khouaja_Maghribi"/>
-                <w:b/>
-                <w:bCs/>
-                <w:color w:val="000000" w:themeColor="text1"/>
-                <w:sz w:val="32"/>
-                <w:szCs w:val="32"/>
-                <w:rtl/>
-                <w:lang w:bidi="ar-MA"/>
-              </w:rPr>
-            </w:pPr>
-            <w:r>
-              <w:rPr>
-                <w:rFonts w:cs="Samir_Khouaja_Maghribi" w:hint="cs"/>
-                <w:b/>
-                <w:bCs/>
-                <w:color w:val="000000" w:themeColor="text1"/>
-                <w:sz w:val="28"/>
-                <w:szCs w:val="28"/>
-                <w:rtl/>
-                <w:lang w:bidi="ar-MA"/>
+              <w:jc w:val="center"/>
+              <w:rPr>
+                <w:b/>
+                <w:sz w:val="24"/>
+              </w:rPr>
+            </w:pPr>
+            <w:r>
+              <w:rPr>
+                <w:b/>
+                <w:sz w:val="24"/>
               </w:rPr>
               <w:t>المهارات السلوكية والعملية</w:t>
             </w:r>
@@ -1583,22 +1548,32 @@
         <w:trPr>
           <w:trHeight w:val="482"/>
         </w:trPr>
-        <w:p>
-          <w:pPr>
-            <w:jc w:val="center"/>
-          </w:pPr>
-          <w:r>
-            <w:t>{c2_no}</w:t>
-          </w:r>
-        </w:p>
-        <w:p>
-          <w:pPr>
-            <w:jc w:val="center"/>
-          </w:pPr>
-          <w:r>
-            <w:t>{c2_yes}</w:t>
-          </w:r>
-        </w:p>
+        <w:tc>
+          <w:tcPr>
+            <w:tcW w:w="1546" w:type="dxa"/>
+          </w:tcPr>
+          <w:p>
+            <w:pPr>
+              <w:jc w:val="center"/>
+            </w:pPr>
+            <w:r>
+              <w:t>{c2_no}</w:t>
+            </w:r>
+          </w:p>
+        </w:tc>
+        <w:tc>
+          <w:tcPr>
+            <w:tcW w:w="1823" w:type="dxa"/>
+          </w:tcPr>
+          <w:p>
+            <w:pPr>
+              <w:jc w:val="center"/>
+            </w:pPr>
+            <w:r>
+              <w:t>{c2_yes}</w:t>
+            </w:r>
+          </w:p>
+        </w:tc>
         <w:tc>
           <w:tcPr>
             <w:tcW w:w="3298" w:type="dxa"/>
@@ -1606,30 +1581,16 @@
           </w:tcPr>
           <w:p>
             <w:pPr>
-              <w:bidi/>
-              <w:jc w:val="center"/>
-              <w:textAlignment w:val="baseline"/>
-              <w:rPr>
-                <w:rFonts w:cs="Samir_Khouaja_Maghribi"/>
-                <w:b/>
-                <w:bCs/>
-                <w:color w:val="000000" w:themeColor="text1"/>
-                <w:sz w:val="24"/>
-                <w:szCs w:val="24"/>
-                <w:rtl/>
-                <w:lang w:bidi="ar-MA"/>
-              </w:rPr>
-            </w:pPr>
-            <w:r>
-              <w:rPr>
-                <w:rFonts w:cs="Samir_Khouaja_Maghribi" w:hint="cs"/>
-                <w:b/>
-                <w:bCs/>
-                <w:color w:val="000000" w:themeColor="text1"/>
-                <w:sz w:val="24"/>
-                <w:szCs w:val="24"/>
-                <w:rtl/>
-                <w:lang w:bidi="ar-MA"/>
+              <w:jc w:val="center"/>
+              <w:rPr>
+                <w:b/>
+                <w:sz w:val="24"/>
+              </w:rPr>
+            </w:pPr>
+            <w:r>
+              <w:rPr>
+                <w:b/>
+                <w:sz w:val="24"/>
               </w:rPr>
               <w:t>حسن التعامل</w:t>
             </w:r>
@@ -1641,37 +1602,39 @@
             <w:gridSpan w:val="2"/>
             <w:vMerge/>
           </w:tcPr>
-          <w:p>
-            <w:pPr>
-              <w:jc w:val="center"/>
-              <w:rPr>
-                <w:u w:val="single"/>
-                <w:rtl/>
-              </w:rPr>
-            </w:pPr>
-          </w:p>
+          <w:p/>
         </w:tc>
       </w:tr>
       <w:tr>
         <w:trPr>
-          <w:trHeight w:val="425"/>
+          <w:trHeight w:val="482"/>
         </w:trPr>
-        <w:p>
-          <w:pPr>
-            <w:jc w:val="center"/>
-          </w:pPr>
-          <w:r>
-            <w:t>{c3_no}</w:t>
-          </w:r>
-        </w:p>
-        <w:p>
-          <w:pPr>
-            <w:jc w:val="center"/>
-          </w:pPr>
-          <w:r>
-            <w:t>{c3_yes}</w:t>
-          </w:r>
-        </w:p>
+        <w:tc>
+          <w:tcPr>
+            <w:tcW w:w="1546" w:type="dxa"/>
+          </w:tcPr>
+          <w:p>
+            <w:pPr>
+              <w:jc w:val="center"/>
+            </w:pPr>
+            <w:r>
+              <w:t>{c3_no}</w:t>
+            </w:r>
+          </w:p>
+        </w:tc>
+        <w:tc>
+          <w:tcPr>
+            <w:tcW w:w="1823" w:type="dxa"/>
+          </w:tcPr>
+          <w:p>
+            <w:pPr>
+              <w:jc w:val="center"/>
+            </w:pPr>
+            <w:r>
+              <w:t>{c3_yes}</w:t>
+            </w:r>
+          </w:p>
+        </w:tc>
         <w:tc>
           <w:tcPr>
             <w:tcW w:w="3298" w:type="dxa"/>
@@ -1679,30 +1642,16 @@
           </w:tcPr>
           <w:p>
             <w:pPr>
-              <w:bidi/>
-              <w:jc w:val="center"/>
-              <w:textAlignment w:val="baseline"/>
-              <w:rPr>
-                <w:rFonts w:cs="Samir_Khouaja_Maghribi"/>
-                <w:b/>
-                <w:bCs/>
-                <w:color w:val="000000" w:themeColor="text1"/>
-                <w:sz w:val="24"/>
-                <w:szCs w:val="24"/>
-                <w:rtl/>
-                <w:lang w:bidi="ar-MA"/>
-              </w:rPr>
-            </w:pPr>
-            <w:r>
-              <w:rPr>
-                <w:rFonts w:cs="Samir_Khouaja_Maghribi" w:hint="cs"/>
-                <w:b/>
-                <w:bCs/>
-                <w:color w:val="000000" w:themeColor="text1"/>
-                <w:sz w:val="24"/>
-                <w:szCs w:val="24"/>
-                <w:rtl/>
-                <w:lang w:bidi="ar-MA"/>
+              <w:jc w:val="center"/>
+              <w:rPr>
+                <w:b/>
+                <w:sz w:val="24"/>
+              </w:rPr>
+            </w:pPr>
+            <w:r>
+              <w:rPr>
+                <w:b/>
+                <w:sz w:val="24"/>
               </w:rPr>
               <w:t>الجدية في العمل</w:t>
             </w:r>
@@ -1714,15 +1663,7 @@
             <w:gridSpan w:val="2"/>
             <w:vMerge/>
           </w:tcPr>
-          <w:p>
-            <w:pPr>
-              <w:jc w:val="center"/>
-              <w:rPr>
-                <w:u w:val="single"/>
-                <w:rtl/>
-              </w:rPr>
-            </w:pPr>
-          </w:p>
+          <w:p/>
         </w:tc>
       </w:tr>
       <w:tr>
@@ -1875,7 +1816,7 @@
                 <w:rtl/>
                 <w:lang w:bidi="ar-MA"/>
               </w:rPr>
-              <w:t>{notes}</w:t>
+              <w:t/>
             </w:r>
             <w:r>
               <w:rPr>
@@ -1900,7 +1841,7 @@
                 <w:rtl/>
                 <w:lang w:bidi="ar-MA"/>
               </w:rPr>
-              <w:t xml:space="preserve"> ...........................................................</w:t>
+              <w:t/>
             </w:r>
             <w:r>
               <w:rPr>
@@ -1925,7 +1866,7 @@
                 <w:rtl/>
                 <w:lang w:bidi="ar-MA"/>
               </w:rPr>
-              <w:t xml:space="preserve"> ...........................................................</w:t>
+              <w:t/>
             </w:r>
             <w:r>
               <w:rPr>
@@ -1950,7 +1891,7 @@
                 <w:rtl/>
                 <w:lang w:bidi="ar-MA"/>
               </w:rPr>
-              <w:t xml:space="preserve"> ...........................................................</w:t>
+              <w:t/>
             </w:r>
             <w:r>
               <w:rPr>

</xml_diff>